<commit_message>
feat: Bổ sung các dịch vụ quản lý tài sản xe, bao gồm bảo lãnh, giải ngân, quản lý kho và tạo tài liệu tự động.
</commit_message>
<xml_diff>
--- a/src/main/resources/templates/DeNghiCapBaoLanh/de-nghi-cap-bao-lanh-hyundai.docx
+++ b/src/main/resources/templates/DeNghiCapBaoLanh/de-nghi-cap-bao-lanh-hyundai.docx
@@ -66,7 +66,7 @@
                 <w:noProof/>
               </w:rPr>
               <w:drawing>
-                <wp:anchor distT="0" distB="0" distL="114300" distR="114300" simplePos="0" relativeHeight="251659264" behindDoc="0" locked="0" layoutInCell="1" allowOverlap="1" wp14:anchorId="658827BB" wp14:editId="6F87DE56">
+                <wp:anchor distT="0" distB="0" distL="114300" distR="114300" simplePos="0" relativeHeight="251659264" behindDoc="0" locked="0" layoutInCell="1" allowOverlap="1" wp14:anchorId="658827BB" wp14:editId="5D46EBF8">
                   <wp:simplePos x="0" y="0"/>
                   <wp:positionH relativeFrom="column">
                     <wp:posOffset>-6350</wp:posOffset>
@@ -619,23 +619,20 @@
     </w:p>
     <w:p>
       <w:pPr>
-        <w:spacing w:before="240" w:after="60" w:line="276" w:lineRule="auto"/>
+        <w:spacing w:line="276" w:lineRule="auto"/>
         <w:ind w:firstLine="567"/>
         <w:jc w:val="both"/>
         <w:rPr>
-          <w:i/>
-          <w:noProof/>
           <w:sz w:val="24"/>
           <w:lang w:val="fr-FR"/>
         </w:rPr>
       </w:pPr>
       <w:r>
         <w:rPr>
-          <w:noProof/>
           <w:sz w:val="24"/>
           <w:lang w:val="fr-FR"/>
         </w:rPr>
-        <w:t xml:space="preserve">Căn cứ Hợp đồng tín dụng hạn mức số: </w:t>
+        <w:t xml:space="preserve">Bằng văn bản này, đề nghị Ngân hàng cấp bảo lãnh cho chúng tôi số tiền là : </w:t>
       </w:r>
       <w:r>
         <w:rPr>
@@ -643,46 +640,14 @@
           <w:sz w:val="24"/>
           <w:lang w:val="fr-FR"/>
         </w:rPr>
-        <w:t>{{HDTD}} ngày {{HDTD_DATE}}</w:t>
+        <w:t>{{TONG}} (Bằng chữ : {{TONG_TEXT}}</w:t>
       </w:r>
       <w:r>
         <w:rPr>
           <w:sz w:val="24"/>
           <w:lang w:val="fr-FR"/>
         </w:rPr>
-        <w:t xml:space="preserve"> (sau đây gọi là “Hợp đồng tín dụng hạn mức”) ký</w:t>
-      </w:r>
-      <w:r>
-        <w:rPr>
-          <w:bCs/>
-          <w:sz w:val="24"/>
-          <w:lang w:val="fr-FR"/>
-        </w:rPr>
-        <w:t xml:space="preserve"> </w:t>
-      </w:r>
-      <w:r>
-        <w:rPr>
-          <w:noProof/>
-          <w:sz w:val="24"/>
-          <w:lang w:val="fr-FR"/>
-        </w:rPr>
-        <w:t xml:space="preserve">giữa Công ty chúng tôi và </w:t>
-      </w:r>
-      <w:r>
-        <w:rPr>
-          <w:sz w:val="24"/>
-          <w:lang w:val="fr-FR"/>
-        </w:rPr>
-        <w:t>Ngân hàng</w:t>
-      </w:r>
-      <w:r>
-        <w:rPr>
-          <w:i/>
-          <w:noProof/>
-          <w:sz w:val="24"/>
-          <w:lang w:val="fr-FR"/>
-        </w:rPr>
-        <w:t>.</w:t>
+        <w:t>).</w:t>
       </w:r>
     </w:p>
     <w:p>

</xml_diff>